<commit_message>
Add screenshots to Lab 12 Steps 5 and 6, and rebuild four stale docx
Three captures from a live run on a kind cluster with SeaweedFS, Velero 1.18.2
and a Postgres workload holding real rows.

Step 5 is the one that matters: the backup reports Completed with zero errors
and zero warnings, the restore reports Completed, the PVC comes back Bound and
the Deployment 1/1 — and the database answers 'relation "orders" does not
exist'. Velero backed up the objects and never touched the bytes, Postgres
found an empty data directory and ran initdb, and nothing anywhere reports a
problem.

Step 6 shows the schedule with its backup TTL and the absolute expiration
stamp resolved onto an existing backup. The quoted timestamps are updated to
the captured run.

Labs 2, 3, 16 and 17 had docx older than their markdown; rebuilt.

Every screenshot in the course is now referenced: 115 files, 115 references,
and all 391 relative links resolve.

Co-Authored-By: Claude Opus 5 <noreply@anthropic.com>
</commit_message>
<xml_diff>
--- a/additional/optional-day-control-plane-and-war-room/lab-03-etcd-quota-recovery.docx
+++ b/additional/optional-day-control-plane-and-war-room/lab-03-etcd-quota-recovery.docx
@@ -2,14 +2,6 @@
 <file path=word/document.xml><?xml version="1.0" encoding="utf-8"?>
 <w:document xmlns:w="http://schemas.openxmlformats.org/wordprocessingml/2006/main" xmlns:m="http://schemas.openxmlformats.org/officeDocument/2006/math" xmlns:r="http://schemas.openxmlformats.org/officeDocument/2006/relationships" xmlns:o="urn:schemas-microsoft-com:office:office" xmlns:v="urn:schemas-microsoft-com:vml" xmlns:w10="urn:schemas-microsoft-com:office:word" xmlns:a="http://schemas.openxmlformats.org/drawingml/2006/main" xmlns:pic="http://schemas.openxmlformats.org/drawingml/2006/picture" xmlns:wp="http://schemas.openxmlformats.org/drawingml/2006/wordprocessingDrawing">
   <w:body>
-    <w:p>
-      <w:pPr>
-        <w:pStyle w:val="Title"/>
-      </w:pPr>
-      <w:r>
-        <w:t xml:space="preserve">Lab 3 — Recover a Cluster That's Gone Read-Only (etcd Quota &amp; Recovery)</w:t>
-      </w:r>
-    </w:p>
     <w:p>
       <w:pPr>
         <w:pStyle w:val="Author"/>
@@ -685,7 +677,7 @@
       </w:r>
     </w:p>
     <w:bookmarkEnd w:id="12"/>
-    <w:bookmarkStart w:id="16" w:name="the-idea-in-60-seconds"/>
+    <w:bookmarkStart w:id="13" w:name="the-idea-in-60-seconds"/>
     <w:p>
       <w:pPr>
         <w:pStyle w:val="Heading2"/>
@@ -867,709 +859,736 @@
     </w:p>
     <w:p>
       <w:pPr>
+        <w:pStyle w:val="SourceCode"/>
+      </w:pPr>
+      <w:r>
+        <w:rPr>
+          <w:rStyle w:val="VerbatimChar"/>
+        </w:rPr>
+        <w:t xml:space="preserve">flowchart TB</w:t>
+      </w:r>
+      <w:r>
+        <w:br/>
+      </w:r>
+      <w:r>
+        <w:rPr>
+          <w:rStyle w:val="VerbatimChar"/>
+        </w:rPr>
+        <w:t xml:space="preserve">    WRITE["writes: kubectl create,&lt;br/&gt;controllers, events, leases"] --&gt; DB["etcd boltdb file&lt;br/&gt;grows with every revision"]</w:t>
+      </w:r>
+      <w:r>
+        <w:br/>
+      </w:r>
+      <w:r>
+        <w:rPr>
+          <w:rStyle w:val="VerbatimChar"/>
+        </w:rPr>
+        <w:t xml:space="preserve">    DB --&gt; CHECK{"DB size &amp;gt;= quota-backend-bytes?"}</w:t>
+      </w:r>
+      <w:r>
+        <w:br/>
+      </w:r>
+      <w:r>
+        <w:rPr>
+          <w:rStyle w:val="VerbatimChar"/>
+        </w:rPr>
+        <w:t xml:space="preserve">    CHECK --&gt;|"no"| OK["writes accepted"]</w:t>
+      </w:r>
+      <w:r>
+        <w:br/>
+      </w:r>
+      <w:r>
+        <w:rPr>
+          <w:rStyle w:val="VerbatimChar"/>
+        </w:rPr>
+        <w:t xml:space="preserve">    CHECK --&gt;|"yes"| ALARM["raise NOSPACE alarm"]</w:t>
+      </w:r>
+      <w:r>
+        <w:br/>
+      </w:r>
+      <w:r>
+        <w:rPr>
+          <w:rStyle w:val="VerbatimChar"/>
+        </w:rPr>
+        <w:t xml:space="preserve">    ALARM --&gt; RO["cluster READ-ONLY&lt;br/&gt;every write: 'database space exceeded'&lt;br/&gt;reads still succeed"]</w:t>
+      </w:r>
+      <w:r>
+        <w:br/>
+      </w:r>
+      <w:r>
+        <w:rPr>
+          <w:rStyle w:val="VerbatimChar"/>
+        </w:rPr>
+        <w:t xml:space="preserve">    RO --&gt; RECOVER["compact history&lt;br/&gt;defrag (reclaim pages)&lt;br/&gt;alarm disarm"]</w:t>
+      </w:r>
+      <w:r>
+        <w:br/>
+      </w:r>
+      <w:r>
+        <w:rPr>
+          <w:rStyle w:val="VerbatimChar"/>
+        </w:rPr>
+        <w:t xml:space="preserve">    RECOVER --&gt; OK</w:t>
+      </w:r>
+    </w:p>
+    <w:p>
+      <w:r>
+        <w:pict>
+          <v:rect style="width:0;height:1.5pt" o:hralign="center" o:hrstd="t" o:hr="t"/>
+        </w:pict>
+      </w:r>
+    </w:p>
+    <w:bookmarkEnd w:id="13"/>
+    <w:bookmarkStart w:id="17" w:name="Xb4b3c804d6bc08252d065ed8a6b12b6ce42b27e"/>
+    <w:p>
+      <w:pPr>
+        <w:pStyle w:val="Heading2"/>
+      </w:pPr>
+      <w:r>
+        <w:t xml:space="preserve">Step 1 — Build a throwaway cluster and shrink etcd's quota</w:t>
+      </w:r>
+    </w:p>
+    <w:p>
+      <w:pPr>
         <w:pStyle w:val="FirstParagraph"/>
+      </w:pPr>
+      <w:r>
+        <w:rPr>
+          <w:b/>
+          <w:bCs/>
+        </w:rPr>
+        <w:t xml:space="preserve">Goal:</w:t>
+      </w:r>
+      <w:r>
+        <w:t xml:space="preserve"> </w:t>
+      </w:r>
+      <w:r>
+        <w:t xml:space="preserve">stand up a dedicated cluster and lower etcd's quota to 16 MiB so you can fill it in minutes instead of hours.</w:t>
+      </w:r>
+    </w:p>
+    <w:p>
+      <w:pPr>
+        <w:pStyle w:val="BodyText"/>
+      </w:pPr>
+      <w:r>
+        <w:rPr>
+          <w:b/>
+          <w:bCs/>
+        </w:rPr>
+        <w:t xml:space="preserve">1. Create the cluster:</w:t>
+      </w:r>
+    </w:p>
+    <w:p>
+      <w:pPr>
+        <w:pStyle w:val="SourceCode"/>
+      </w:pPr>
+      <w:r>
+        <w:rPr>
+          <w:rStyle w:val="ExtensionTok"/>
+        </w:rPr>
+        <w:t xml:space="preserve">kind</w:t>
+      </w:r>
+      <w:r>
+        <w:rPr>
+          <w:rStyle w:val="NormalTok"/>
+        </w:rPr>
+        <w:t xml:space="preserve"> create cluster </w:t>
+      </w:r>
+      <w:r>
+        <w:rPr>
+          <w:rStyle w:val="AttributeTok"/>
+        </w:rPr>
+        <w:t xml:space="preserve">--name</w:t>
+      </w:r>
+      <w:r>
+        <w:rPr>
+          <w:rStyle w:val="NormalTok"/>
+        </w:rPr>
+        <w:t xml:space="preserve"> etcd-lab </w:t>
+      </w:r>
+      <w:r>
+        <w:rPr>
+          <w:rStyle w:val="AttributeTok"/>
+        </w:rPr>
+        <w:t xml:space="preserve">--wait</w:t>
+      </w:r>
+      <w:r>
+        <w:rPr>
+          <w:rStyle w:val="NormalTok"/>
+        </w:rPr>
+        <w:t xml:space="preserve"> 120s</w:t>
+      </w:r>
+    </w:p>
+    <w:p>
+      <w:pPr>
+        <w:pStyle w:val="FirstParagraph"/>
+      </w:pPr>
+      <w:r>
+        <w:rPr>
+          <w:b/>
+          <w:bCs/>
+        </w:rPr>
+        <w:t xml:space="preserve">2. Lower the quota.</w:t>
+      </w:r>
+      <w:r>
+        <w:t xml:space="preserve"> </w:t>
+      </w:r>
+      <w:r>
+        <w:t xml:space="preserve">etcd runs as a static Pod on the control-plane node; add a flag to its manifest and the kubelet restarts etcd automatically:</w:t>
+      </w:r>
+    </w:p>
+    <w:p>
+      <w:pPr>
+        <w:pStyle w:val="SourceCode"/>
+      </w:pPr>
+      <w:r>
+        <w:rPr>
+          <w:rStyle w:val="ExtensionTok"/>
+        </w:rPr>
+        <w:t xml:space="preserve">docker</w:t>
+      </w:r>
+      <w:r>
+        <w:rPr>
+          <w:rStyle w:val="NormalTok"/>
+        </w:rPr>
+        <w:t xml:space="preserve"> exec etcd-lab-control-plane </w:t>
+      </w:r>
+      <w:r>
+        <w:rPr>
+          <w:rStyle w:val="DataTypeTok"/>
+        </w:rPr>
+        <w:t xml:space="preserve">\</w:t>
+      </w:r>
+      <w:r>
+        <w:br/>
+      </w:r>
+      <w:r>
+        <w:rPr>
+          <w:rStyle w:val="NormalTok"/>
+        </w:rPr>
+        <w:t xml:space="preserve">  sed </w:t>
+      </w:r>
+      <w:r>
+        <w:rPr>
+          <w:rStyle w:val="AttributeTok"/>
+        </w:rPr>
+        <w:t xml:space="preserve">-i</w:t>
+      </w:r>
+      <w:r>
+        <w:rPr>
+          <w:rStyle w:val="NormalTok"/>
+        </w:rPr>
+        <w:t xml:space="preserve"> </w:t>
+      </w:r>
+      <w:r>
+        <w:rPr>
+          <w:rStyle w:val="StringTok"/>
+        </w:rPr>
+        <w:t xml:space="preserve">'/^    - etcd$/a\    - --quota-backend-bytes=16777216'</w:t>
+      </w:r>
+      <w:r>
+        <w:rPr>
+          <w:rStyle w:val="NormalTok"/>
+        </w:rPr>
+        <w:t xml:space="preserve"> </w:t>
+      </w:r>
+      <w:r>
+        <w:rPr>
+          <w:rStyle w:val="DataTypeTok"/>
+        </w:rPr>
+        <w:t xml:space="preserve">\</w:t>
+      </w:r>
+      <w:r>
+        <w:br/>
+      </w:r>
+      <w:r>
+        <w:rPr>
+          <w:rStyle w:val="NormalTok"/>
+        </w:rPr>
+        <w:t xml:space="preserve">  /etc/kubernetes/manifests/etcd.yaml</w:t>
+      </w:r>
+    </w:p>
+    <w:p>
+      <w:pPr>
+        <w:pStyle w:val="FirstParagraph"/>
+      </w:pPr>
+      <w:r>
+        <w:rPr>
+          <w:b/>
+          <w:bCs/>
+        </w:rPr>
+        <w:t xml:space="preserve">3. Set up a one-word helper</w:t>
+      </w:r>
+      <w:r>
+        <w:t xml:space="preserve"> </w:t>
+      </w:r>
+      <w:r>
+        <w:t xml:space="preserve">for the long</w:t>
+      </w:r>
+      <w:r>
+        <w:t xml:space="preserve"> </w:t>
+      </w:r>
+      <w:r>
+        <w:rPr>
+          <w:rStyle w:val="VerbatimChar"/>
+        </w:rPr>
+        <w:t xml:space="preserve">etcdctl</w:t>
+      </w:r>
+      <w:r>
+        <w:t xml:space="preserve"> </w:t>
+      </w:r>
+      <w:r>
+        <w:t xml:space="preserve">command (with all its TLS flags), then check the new quota took effect:</w:t>
+      </w:r>
+    </w:p>
+    <w:p>
+      <w:pPr>
+        <w:pStyle w:val="SourceCode"/>
+      </w:pPr>
+      <w:r>
+        <w:rPr>
+          <w:rStyle w:val="FunctionTok"/>
+        </w:rPr>
+        <w:t xml:space="preserve">e()</w:t>
+      </w:r>
+      <w:r>
+        <w:rPr>
+          <w:rStyle w:val="NormalTok"/>
+        </w:rPr>
+        <w:t xml:space="preserve"> </w:t>
+      </w:r>
+      <w:r>
+        <w:rPr>
+          <w:rStyle w:val="KeywordTok"/>
+        </w:rPr>
+        <w:t xml:space="preserve">{</w:t>
+      </w:r>
+      <w:r>
+        <w:br/>
+      </w:r>
+      <w:r>
+        <w:rPr>
+          <w:rStyle w:val="NormalTok"/>
+        </w:rPr>
+        <w:t xml:space="preserve">  </w:t>
+      </w:r>
+      <w:r>
+        <w:rPr>
+          <w:rStyle w:val="ExtensionTok"/>
+        </w:rPr>
+        <w:t xml:space="preserve">kubectl</w:t>
+      </w:r>
+      <w:r>
+        <w:rPr>
+          <w:rStyle w:val="NormalTok"/>
+        </w:rPr>
+        <w:t xml:space="preserve"> </w:t>
+      </w:r>
+      <w:r>
+        <w:rPr>
+          <w:rStyle w:val="AttributeTok"/>
+        </w:rPr>
+        <w:t xml:space="preserve">-n</w:t>
+      </w:r>
+      <w:r>
+        <w:rPr>
+          <w:rStyle w:val="NormalTok"/>
+        </w:rPr>
+        <w:t xml:space="preserve"> kube-system exec etcd-etcd-lab-control-plane </w:t>
+      </w:r>
+      <w:r>
+        <w:rPr>
+          <w:rStyle w:val="AttributeTok"/>
+        </w:rPr>
+        <w:t xml:space="preserve">--</w:t>
+      </w:r>
+      <w:r>
+        <w:rPr>
+          <w:rStyle w:val="NormalTok"/>
+        </w:rPr>
+        <w:t xml:space="preserve"> etcdctl </w:t>
+      </w:r>
+      <w:r>
+        <w:rPr>
+          <w:rStyle w:val="DataTypeTok"/>
+        </w:rPr>
+        <w:t xml:space="preserve">\</w:t>
+      </w:r>
+      <w:r>
+        <w:br/>
+      </w:r>
+      <w:r>
+        <w:rPr>
+          <w:rStyle w:val="NormalTok"/>
+        </w:rPr>
+        <w:t xml:space="preserve">    </w:t>
+      </w:r>
+      <w:r>
+        <w:rPr>
+          <w:rStyle w:val="AttributeTok"/>
+        </w:rPr>
+        <w:t xml:space="preserve">--endpoints</w:t>
+      </w:r>
+      <w:r>
+        <w:rPr>
+          <w:rStyle w:val="OperatorTok"/>
+        </w:rPr>
+        <w:t xml:space="preserve">=</w:t>
+      </w:r>
+      <w:r>
+        <w:rPr>
+          <w:rStyle w:val="NormalTok"/>
+        </w:rPr>
+        <w:t xml:space="preserve">https://127.0.0.1:2379 </w:t>
+      </w:r>
+      <w:r>
+        <w:rPr>
+          <w:rStyle w:val="DataTypeTok"/>
+        </w:rPr>
+        <w:t xml:space="preserve">\</w:t>
+      </w:r>
+      <w:r>
+        <w:br/>
+      </w:r>
+      <w:r>
+        <w:rPr>
+          <w:rStyle w:val="NormalTok"/>
+        </w:rPr>
+        <w:t xml:space="preserve">    </w:t>
+      </w:r>
+      <w:r>
+        <w:rPr>
+          <w:rStyle w:val="AttributeTok"/>
+        </w:rPr>
+        <w:t xml:space="preserve">--cacert</w:t>
+      </w:r>
+      <w:r>
+        <w:rPr>
+          <w:rStyle w:val="OperatorTok"/>
+        </w:rPr>
+        <w:t xml:space="preserve">=</w:t>
+      </w:r>
+      <w:r>
+        <w:rPr>
+          <w:rStyle w:val="NormalTok"/>
+        </w:rPr>
+        <w:t xml:space="preserve">/etc/kubernetes/pki/etcd/ca.crt </w:t>
+      </w:r>
+      <w:r>
+        <w:rPr>
+          <w:rStyle w:val="DataTypeTok"/>
+        </w:rPr>
+        <w:t xml:space="preserve">\</w:t>
+      </w:r>
+      <w:r>
+        <w:br/>
+      </w:r>
+      <w:r>
+        <w:rPr>
+          <w:rStyle w:val="NormalTok"/>
+        </w:rPr>
+        <w:t xml:space="preserve">    </w:t>
+      </w:r>
+      <w:r>
+        <w:rPr>
+          <w:rStyle w:val="AttributeTok"/>
+        </w:rPr>
+        <w:t xml:space="preserve">--cert</w:t>
+      </w:r>
+      <w:r>
+        <w:rPr>
+          <w:rStyle w:val="OperatorTok"/>
+        </w:rPr>
+        <w:t xml:space="preserve">=</w:t>
+      </w:r>
+      <w:r>
+        <w:rPr>
+          <w:rStyle w:val="NormalTok"/>
+        </w:rPr>
+        <w:t xml:space="preserve">/etc/kubernetes/pki/etcd/server.crt </w:t>
+      </w:r>
+      <w:r>
+        <w:rPr>
+          <w:rStyle w:val="DataTypeTok"/>
+        </w:rPr>
+        <w:t xml:space="preserve">\</w:t>
+      </w:r>
+      <w:r>
+        <w:br/>
+      </w:r>
+      <w:r>
+        <w:rPr>
+          <w:rStyle w:val="NormalTok"/>
+        </w:rPr>
+        <w:t xml:space="preserve">    </w:t>
+      </w:r>
+      <w:r>
+        <w:rPr>
+          <w:rStyle w:val="AttributeTok"/>
+        </w:rPr>
+        <w:t xml:space="preserve">--key</w:t>
+      </w:r>
+      <w:r>
+        <w:rPr>
+          <w:rStyle w:val="OperatorTok"/>
+        </w:rPr>
+        <w:t xml:space="preserve">=</w:t>
+      </w:r>
+      <w:r>
+        <w:rPr>
+          <w:rStyle w:val="NormalTok"/>
+        </w:rPr>
+        <w:t xml:space="preserve">/etc/kubernetes/pki/etcd/server.key </w:t>
+      </w:r>
+      <w:r>
+        <w:rPr>
+          <w:rStyle w:val="StringTok"/>
+        </w:rPr>
+        <w:t xml:space="preserve">"</w:t>
+      </w:r>
+      <w:r>
+        <w:rPr>
+          <w:rStyle w:val="VariableTok"/>
+        </w:rPr>
+        <w:t xml:space="preserve">$@</w:t>
+      </w:r>
+      <w:r>
+        <w:rPr>
+          <w:rStyle w:val="StringTok"/>
+        </w:rPr>
+        <w:t xml:space="preserve">"</w:t>
+      </w:r>
+      <w:r>
+        <w:br/>
+      </w:r>
+      <w:r>
+        <w:rPr>
+          <w:rStyle w:val="KeywordTok"/>
+        </w:rPr>
+        <w:t xml:space="preserve">}</w:t>
+      </w:r>
+      <w:r>
+        <w:br/>
+      </w:r>
+      <w:r>
+        <w:br/>
+      </w:r>
+      <w:r>
+        <w:rPr>
+          <w:rStyle w:val="ExtensionTok"/>
+        </w:rPr>
+        <w:t xml:space="preserve">e</w:t>
+      </w:r>
+      <w:r>
+        <w:rPr>
+          <w:rStyle w:val="NormalTok"/>
+        </w:rPr>
+        <w:t xml:space="preserve"> endpoint status </w:t>
+      </w:r>
+      <w:r>
+        <w:rPr>
+          <w:rStyle w:val="AttributeTok"/>
+        </w:rPr>
+        <w:t xml:space="preserve">-w</w:t>
+      </w:r>
+      <w:r>
+        <w:rPr>
+          <w:rStyle w:val="NormalTok"/>
+        </w:rPr>
+        <w:t xml:space="preserve"> fields </w:t>
+      </w:r>
+      <w:r>
+        <w:rPr>
+          <w:rStyle w:val="KeywordTok"/>
+        </w:rPr>
+        <w:t xml:space="preserve">|</w:t>
+      </w:r>
+      <w:r>
+        <w:rPr>
+          <w:rStyle w:val="NormalTok"/>
+        </w:rPr>
+        <w:t xml:space="preserve"> </w:t>
+      </w:r>
+      <w:r>
+        <w:rPr>
+          <w:rStyle w:val="FunctionTok"/>
+        </w:rPr>
+        <w:t xml:space="preserve">grep</w:t>
+      </w:r>
+      <w:r>
+        <w:rPr>
+          <w:rStyle w:val="NormalTok"/>
+        </w:rPr>
+        <w:t xml:space="preserve"> </w:t>
+      </w:r>
+      <w:r>
+        <w:rPr>
+          <w:rStyle w:val="AttributeTok"/>
+        </w:rPr>
+        <w:t xml:space="preserve">-E</w:t>
+      </w:r>
+      <w:r>
+        <w:rPr>
+          <w:rStyle w:val="NormalTok"/>
+        </w:rPr>
+        <w:t xml:space="preserve"> </w:t>
+      </w:r>
+      <w:r>
+        <w:rPr>
+          <w:rStyle w:val="StringTok"/>
+        </w:rPr>
+        <w:t xml:space="preserve">'"DBSize"|"DBSizeInUse"|"DBSizeQuota"'</w:t>
+      </w:r>
+    </w:p>
+    <w:p>
+      <w:pPr>
+        <w:pStyle w:val="FirstParagraph"/>
+      </w:pPr>
+      <w:r>
+        <w:rPr>
+          <w:i/>
+          <w:iCs/>
+        </w:rPr>
+        <w:t xml:space="preserve">(We grep the</w:t>
+      </w:r>
+      <w:r>
+        <w:rPr>
+          <w:i/>
+          <w:iCs/>
+        </w:rPr>
+        <w:t xml:space="preserve"> </w:t>
+      </w:r>
+      <w:r>
+        <w:rPr>
+          <w:rStyle w:val="VerbatimChar"/>
+          <w:i/>
+          <w:iCs/>
+        </w:rPr>
+        <w:t xml:space="preserve">-w fields</w:t>
+      </w:r>
+      <w:r>
+        <w:rPr>
+          <w:i/>
+          <w:iCs/>
+        </w:rPr>
+        <w:t xml:space="preserve"> </w:t>
+      </w:r>
+      <w:r>
+        <w:rPr>
+          <w:i/>
+          <w:iCs/>
+        </w:rPr>
+        <w:t xml:space="preserve">output because the full</w:t>
+      </w:r>
+      <w:r>
+        <w:rPr>
+          <w:i/>
+          <w:iCs/>
+        </w:rPr>
+        <w:t xml:space="preserve"> </w:t>
+      </w:r>
+      <w:r>
+        <w:rPr>
+          <w:rStyle w:val="VerbatimChar"/>
+          <w:i/>
+          <w:iCs/>
+        </w:rPr>
+        <w:t xml:space="preserve">-w table</w:t>
+      </w:r>
+      <w:r>
+        <w:rPr>
+          <w:i/>
+          <w:iCs/>
+        </w:rPr>
+        <w:t xml:space="preserve"> </w:t>
+      </w:r>
+      <w:r>
+        <w:rPr>
+          <w:i/>
+          <w:iCs/>
+        </w:rPr>
+        <w:t xml:space="preserve">is 17 columns wide and unreadable.)</w:t>
+      </w:r>
+    </w:p>
+    <w:p>
+      <w:pPr>
+        <w:pStyle w:val="BodyText"/>
+      </w:pPr>
+      <w:r>
+        <w:rPr>
+          <w:b/>
+          <w:bCs/>
+        </w:rPr>
+        <w:t xml:space="preserve">What you should see:</w:t>
+      </w:r>
+      <w:r>
+        <w:t xml:space="preserve"> </w:t>
+      </w:r>
+      <w:r>
+        <w:rPr>
+          <w:rStyle w:val="VerbatimChar"/>
+        </w:rPr>
+        <w:t xml:space="preserve">DBSizeQuota</w:t>
+      </w:r>
+      <w:r>
+        <w:t xml:space="preserve"> </w:t>
+      </w:r>
+      <w:r>
+        <w:t xml:space="preserve">now reads</w:t>
+      </w:r>
+      <w:r>
+        <w:t xml:space="preserve"> </w:t>
+      </w:r>
+      <w:r>
+        <w:rPr>
+          <w:b/>
+          <w:bCs/>
+        </w:rPr>
+        <w:t xml:space="preserve">16777216</w:t>
+      </w:r>
+      <w:r>
+        <w:t xml:space="preserve"> </w:t>
+      </w:r>
+      <w:r>
+        <w:t xml:space="preserve">(16 MiB), with</w:t>
+      </w:r>
+      <w:r>
+        <w:t xml:space="preserve"> </w:t>
+      </w:r>
+      <w:r>
+        <w:rPr>
+          <w:rStyle w:val="VerbatimChar"/>
+        </w:rPr>
+        <w:t xml:space="preserve">DBSize</w:t>
+      </w:r>
+      <w:r>
+        <w:t xml:space="preserve"> </w:t>
+      </w:r>
+      <w:r>
+        <w:t xml:space="preserve">only ~0.5–2 MB — so there's ~15 MB of headroom to fill.</w:t>
+      </w:r>
+    </w:p>
+    <w:p>
+      <w:pPr>
+        <w:pStyle w:val="BodyText"/>
       </w:pPr>
       <w:r>
         <w:drawing>
           <wp:inline>
-            <wp:extent cx="4724400" cy="14097000"/>
+            <wp:extent cx="5943600" cy="3736158"/>
             <wp:effectExtent b="0" l="0" r="0" t="0"/>
-            <wp:docPr descr="Architecture diagram" title="" id="14" name="Picture"/>
+            <wp:docPr descr="etcd restarted with a 16 MiB quota" title="" id="15" name="Picture"/>
             <a:graphic>
               <a:graphicData uri="http://schemas.openxmlformats.org/drawingml/2006/picture">
                 <pic:pic>
                   <pic:nvPicPr>
-                    <pic:cNvPr descr="artifacts/lab-03/diagrams/diagram.png" id="15" name="Picture"/>
+                    <pic:cNvPr descr="../../artifacts/lab-03/screenshots/01-quota-lowered.png" id="16" name="Picture"/>
                     <pic:cNvPicPr>
                       <a:picLocks noChangeArrowheads="1" noChangeAspect="1"/>
                     </pic:cNvPicPr>
                   </pic:nvPicPr>
                   <pic:blipFill>
-                    <a:blip r:embed="rId13"/>
-                    <a:stretch>
-                      <a:fillRect/>
-                    </a:stretch>
-                  </pic:blipFill>
-                  <pic:spPr bwMode="auto">
-                    <a:xfrm>
-                      <a:off x="0" y="0"/>
-                      <a:ext cx="4724400" cy="14097000"/>
-                    </a:xfrm>
-                    <a:prstGeom prst="rect">
-                      <a:avLst/>
-                    </a:prstGeom>
-                    <a:noFill/>
-                    <a:ln w="9525">
-                      <a:noFill/>
-                      <a:headEnd/>
-                      <a:tailEnd/>
-                    </a:ln>
-                  </pic:spPr>
-                </pic:pic>
-              </a:graphicData>
-            </a:graphic>
-          </wp:inline>
-        </w:drawing>
-      </w:r>
-    </w:p>
-    <w:p>
-      <w:r>
-        <w:pict>
-          <v:rect style="width:0;height:1.5pt" o:hralign="center" o:hrstd="t" o:hr="t"/>
-        </w:pict>
-      </w:r>
-    </w:p>
-    <w:bookmarkEnd w:id="16"/>
-    <w:bookmarkStart w:id="20" w:name="Xb4b3c804d6bc08252d065ed8a6b12b6ce42b27e"/>
-    <w:p>
-      <w:pPr>
-        <w:pStyle w:val="Heading2"/>
-      </w:pPr>
-      <w:r>
-        <w:t xml:space="preserve">Step 1 — Build a throwaway cluster and shrink etcd's quota</w:t>
-      </w:r>
-    </w:p>
-    <w:p>
-      <w:pPr>
-        <w:pStyle w:val="FirstParagraph"/>
-      </w:pPr>
-      <w:r>
-        <w:rPr>
-          <w:b/>
-          <w:bCs/>
-        </w:rPr>
-        <w:t xml:space="preserve">Goal:</w:t>
-      </w:r>
-      <w:r>
-        <w:t xml:space="preserve"> </w:t>
-      </w:r>
-      <w:r>
-        <w:t xml:space="preserve">stand up a dedicated cluster and lower etcd's quota to 16 MiB so you can fill it in minutes instead of hours.</w:t>
-      </w:r>
-    </w:p>
-    <w:p>
-      <w:pPr>
-        <w:pStyle w:val="BodyText"/>
-      </w:pPr>
-      <w:r>
-        <w:rPr>
-          <w:b/>
-          <w:bCs/>
-        </w:rPr>
-        <w:t xml:space="preserve">1. Create the cluster:</w:t>
-      </w:r>
-    </w:p>
-    <w:p>
-      <w:pPr>
-        <w:pStyle w:val="SourceCode"/>
-      </w:pPr>
-      <w:r>
-        <w:rPr>
-          <w:rStyle w:val="ExtensionTok"/>
-        </w:rPr>
-        <w:t xml:space="preserve">kind</w:t>
-      </w:r>
-      <w:r>
-        <w:rPr>
-          <w:rStyle w:val="NormalTok"/>
-        </w:rPr>
-        <w:t xml:space="preserve"> create cluster </w:t>
-      </w:r>
-      <w:r>
-        <w:rPr>
-          <w:rStyle w:val="AttributeTok"/>
-        </w:rPr>
-        <w:t xml:space="preserve">--name</w:t>
-      </w:r>
-      <w:r>
-        <w:rPr>
-          <w:rStyle w:val="NormalTok"/>
-        </w:rPr>
-        <w:t xml:space="preserve"> etcd-lab </w:t>
-      </w:r>
-      <w:r>
-        <w:rPr>
-          <w:rStyle w:val="AttributeTok"/>
-        </w:rPr>
-        <w:t xml:space="preserve">--wait</w:t>
-      </w:r>
-      <w:r>
-        <w:rPr>
-          <w:rStyle w:val="NormalTok"/>
-        </w:rPr>
-        <w:t xml:space="preserve"> 120s</w:t>
-      </w:r>
-    </w:p>
-    <w:p>
-      <w:pPr>
-        <w:pStyle w:val="FirstParagraph"/>
-      </w:pPr>
-      <w:r>
-        <w:rPr>
-          <w:b/>
-          <w:bCs/>
-        </w:rPr>
-        <w:t xml:space="preserve">2. Lower the quota.</w:t>
-      </w:r>
-      <w:r>
-        <w:t xml:space="preserve"> </w:t>
-      </w:r>
-      <w:r>
-        <w:t xml:space="preserve">etcd runs as a static Pod on the control-plane node; add a flag to its manifest and the kubelet restarts etcd automatically:</w:t>
-      </w:r>
-    </w:p>
-    <w:p>
-      <w:pPr>
-        <w:pStyle w:val="SourceCode"/>
-      </w:pPr>
-      <w:r>
-        <w:rPr>
-          <w:rStyle w:val="ExtensionTok"/>
-        </w:rPr>
-        <w:t xml:space="preserve">docker</w:t>
-      </w:r>
-      <w:r>
-        <w:rPr>
-          <w:rStyle w:val="NormalTok"/>
-        </w:rPr>
-        <w:t xml:space="preserve"> exec etcd-lab-control-plane </w:t>
-      </w:r>
-      <w:r>
-        <w:rPr>
-          <w:rStyle w:val="DataTypeTok"/>
-        </w:rPr>
-        <w:t xml:space="preserve">\</w:t>
-      </w:r>
-      <w:r>
-        <w:br/>
-      </w:r>
-      <w:r>
-        <w:rPr>
-          <w:rStyle w:val="NormalTok"/>
-        </w:rPr>
-        <w:t xml:space="preserve">  sed </w:t>
-      </w:r>
-      <w:r>
-        <w:rPr>
-          <w:rStyle w:val="AttributeTok"/>
-        </w:rPr>
-        <w:t xml:space="preserve">-i</w:t>
-      </w:r>
-      <w:r>
-        <w:rPr>
-          <w:rStyle w:val="NormalTok"/>
-        </w:rPr>
-        <w:t xml:space="preserve"> </w:t>
-      </w:r>
-      <w:r>
-        <w:rPr>
-          <w:rStyle w:val="StringTok"/>
-        </w:rPr>
-        <w:t xml:space="preserve">'/^    - etcd$/a\    - --quota-backend-bytes=16777216'</w:t>
-      </w:r>
-      <w:r>
-        <w:rPr>
-          <w:rStyle w:val="NormalTok"/>
-        </w:rPr>
-        <w:t xml:space="preserve"> </w:t>
-      </w:r>
-      <w:r>
-        <w:rPr>
-          <w:rStyle w:val="DataTypeTok"/>
-        </w:rPr>
-        <w:t xml:space="preserve">\</w:t>
-      </w:r>
-      <w:r>
-        <w:br/>
-      </w:r>
-      <w:r>
-        <w:rPr>
-          <w:rStyle w:val="NormalTok"/>
-        </w:rPr>
-        <w:t xml:space="preserve">  /etc/kubernetes/manifests/etcd.yaml</w:t>
-      </w:r>
-    </w:p>
-    <w:p>
-      <w:pPr>
-        <w:pStyle w:val="FirstParagraph"/>
-      </w:pPr>
-      <w:r>
-        <w:rPr>
-          <w:b/>
-          <w:bCs/>
-        </w:rPr>
-        <w:t xml:space="preserve">3. Set up a one-word helper</w:t>
-      </w:r>
-      <w:r>
-        <w:t xml:space="preserve"> </w:t>
-      </w:r>
-      <w:r>
-        <w:t xml:space="preserve">for the long</w:t>
-      </w:r>
-      <w:r>
-        <w:t xml:space="preserve"> </w:t>
-      </w:r>
-      <w:r>
-        <w:rPr>
-          <w:rStyle w:val="VerbatimChar"/>
-        </w:rPr>
-        <w:t xml:space="preserve">etcdctl</w:t>
-      </w:r>
-      <w:r>
-        <w:t xml:space="preserve"> </w:t>
-      </w:r>
-      <w:r>
-        <w:t xml:space="preserve">command (with all its TLS flags), then check the new quota took effect:</w:t>
-      </w:r>
-    </w:p>
-    <w:p>
-      <w:pPr>
-        <w:pStyle w:val="SourceCode"/>
-      </w:pPr>
-      <w:r>
-        <w:rPr>
-          <w:rStyle w:val="FunctionTok"/>
-        </w:rPr>
-        <w:t xml:space="preserve">e()</w:t>
-      </w:r>
-      <w:r>
-        <w:rPr>
-          <w:rStyle w:val="NormalTok"/>
-        </w:rPr>
-        <w:t xml:space="preserve"> </w:t>
-      </w:r>
-      <w:r>
-        <w:rPr>
-          <w:rStyle w:val="KeywordTok"/>
-        </w:rPr>
-        <w:t xml:space="preserve">{</w:t>
-      </w:r>
-      <w:r>
-        <w:br/>
-      </w:r>
-      <w:r>
-        <w:rPr>
-          <w:rStyle w:val="NormalTok"/>
-        </w:rPr>
-        <w:t xml:space="preserve">  </w:t>
-      </w:r>
-      <w:r>
-        <w:rPr>
-          <w:rStyle w:val="ExtensionTok"/>
-        </w:rPr>
-        <w:t xml:space="preserve">kubectl</w:t>
-      </w:r>
-      <w:r>
-        <w:rPr>
-          <w:rStyle w:val="NormalTok"/>
-        </w:rPr>
-        <w:t xml:space="preserve"> </w:t>
-      </w:r>
-      <w:r>
-        <w:rPr>
-          <w:rStyle w:val="AttributeTok"/>
-        </w:rPr>
-        <w:t xml:space="preserve">-n</w:t>
-      </w:r>
-      <w:r>
-        <w:rPr>
-          <w:rStyle w:val="NormalTok"/>
-        </w:rPr>
-        <w:t xml:space="preserve"> kube-system exec etcd-etcd-lab-control-plane </w:t>
-      </w:r>
-      <w:r>
-        <w:rPr>
-          <w:rStyle w:val="AttributeTok"/>
-        </w:rPr>
-        <w:t xml:space="preserve">--</w:t>
-      </w:r>
-      <w:r>
-        <w:rPr>
-          <w:rStyle w:val="NormalTok"/>
-        </w:rPr>
-        <w:t xml:space="preserve"> etcdctl </w:t>
-      </w:r>
-      <w:r>
-        <w:rPr>
-          <w:rStyle w:val="DataTypeTok"/>
-        </w:rPr>
-        <w:t xml:space="preserve">\</w:t>
-      </w:r>
-      <w:r>
-        <w:br/>
-      </w:r>
-      <w:r>
-        <w:rPr>
-          <w:rStyle w:val="NormalTok"/>
-        </w:rPr>
-        <w:t xml:space="preserve">    </w:t>
-      </w:r>
-      <w:r>
-        <w:rPr>
-          <w:rStyle w:val="AttributeTok"/>
-        </w:rPr>
-        <w:t xml:space="preserve">--endpoints</w:t>
-      </w:r>
-      <w:r>
-        <w:rPr>
-          <w:rStyle w:val="OperatorTok"/>
-        </w:rPr>
-        <w:t xml:space="preserve">=</w:t>
-      </w:r>
-      <w:r>
-        <w:rPr>
-          <w:rStyle w:val="NormalTok"/>
-        </w:rPr>
-        <w:t xml:space="preserve">https://127.0.0.1:2379 </w:t>
-      </w:r>
-      <w:r>
-        <w:rPr>
-          <w:rStyle w:val="DataTypeTok"/>
-        </w:rPr>
-        <w:t xml:space="preserve">\</w:t>
-      </w:r>
-      <w:r>
-        <w:br/>
-      </w:r>
-      <w:r>
-        <w:rPr>
-          <w:rStyle w:val="NormalTok"/>
-        </w:rPr>
-        <w:t xml:space="preserve">    </w:t>
-      </w:r>
-      <w:r>
-        <w:rPr>
-          <w:rStyle w:val="AttributeTok"/>
-        </w:rPr>
-        <w:t xml:space="preserve">--cacert</w:t>
-      </w:r>
-      <w:r>
-        <w:rPr>
-          <w:rStyle w:val="OperatorTok"/>
-        </w:rPr>
-        <w:t xml:space="preserve">=</w:t>
-      </w:r>
-      <w:r>
-        <w:rPr>
-          <w:rStyle w:val="NormalTok"/>
-        </w:rPr>
-        <w:t xml:space="preserve">/etc/kubernetes/pki/etcd/ca.crt </w:t>
-      </w:r>
-      <w:r>
-        <w:rPr>
-          <w:rStyle w:val="DataTypeTok"/>
-        </w:rPr>
-        <w:t xml:space="preserve">\</w:t>
-      </w:r>
-      <w:r>
-        <w:br/>
-      </w:r>
-      <w:r>
-        <w:rPr>
-          <w:rStyle w:val="NormalTok"/>
-        </w:rPr>
-        <w:t xml:space="preserve">    </w:t>
-      </w:r>
-      <w:r>
-        <w:rPr>
-          <w:rStyle w:val="AttributeTok"/>
-        </w:rPr>
-        <w:t xml:space="preserve">--cert</w:t>
-      </w:r>
-      <w:r>
-        <w:rPr>
-          <w:rStyle w:val="OperatorTok"/>
-        </w:rPr>
-        <w:t xml:space="preserve">=</w:t>
-      </w:r>
-      <w:r>
-        <w:rPr>
-          <w:rStyle w:val="NormalTok"/>
-        </w:rPr>
-        <w:t xml:space="preserve">/etc/kubernetes/pki/etcd/server.crt </w:t>
-      </w:r>
-      <w:r>
-        <w:rPr>
-          <w:rStyle w:val="DataTypeTok"/>
-        </w:rPr>
-        <w:t xml:space="preserve">\</w:t>
-      </w:r>
-      <w:r>
-        <w:br/>
-      </w:r>
-      <w:r>
-        <w:rPr>
-          <w:rStyle w:val="NormalTok"/>
-        </w:rPr>
-        <w:t xml:space="preserve">    </w:t>
-      </w:r>
-      <w:r>
-        <w:rPr>
-          <w:rStyle w:val="AttributeTok"/>
-        </w:rPr>
-        <w:t xml:space="preserve">--key</w:t>
-      </w:r>
-      <w:r>
-        <w:rPr>
-          <w:rStyle w:val="OperatorTok"/>
-        </w:rPr>
-        <w:t xml:space="preserve">=</w:t>
-      </w:r>
-      <w:r>
-        <w:rPr>
-          <w:rStyle w:val="NormalTok"/>
-        </w:rPr>
-        <w:t xml:space="preserve">/etc/kubernetes/pki/etcd/server.key </w:t>
-      </w:r>
-      <w:r>
-        <w:rPr>
-          <w:rStyle w:val="StringTok"/>
-        </w:rPr>
-        <w:t xml:space="preserve">"</w:t>
-      </w:r>
-      <w:r>
-        <w:rPr>
-          <w:rStyle w:val="VariableTok"/>
-        </w:rPr>
-        <w:t xml:space="preserve">$@</w:t>
-      </w:r>
-      <w:r>
-        <w:rPr>
-          <w:rStyle w:val="StringTok"/>
-        </w:rPr>
-        <w:t xml:space="preserve">"</w:t>
-      </w:r>
-      <w:r>
-        <w:br/>
-      </w:r>
-      <w:r>
-        <w:rPr>
-          <w:rStyle w:val="KeywordTok"/>
-        </w:rPr>
-        <w:t xml:space="preserve">}</w:t>
-      </w:r>
-      <w:r>
-        <w:br/>
-      </w:r>
-      <w:r>
-        <w:br/>
-      </w:r>
-      <w:r>
-        <w:rPr>
-          <w:rStyle w:val="ExtensionTok"/>
-        </w:rPr>
-        <w:t xml:space="preserve">e</w:t>
-      </w:r>
-      <w:r>
-        <w:rPr>
-          <w:rStyle w:val="NormalTok"/>
-        </w:rPr>
-        <w:t xml:space="preserve"> endpoint status </w:t>
-      </w:r>
-      <w:r>
-        <w:rPr>
-          <w:rStyle w:val="AttributeTok"/>
-        </w:rPr>
-        <w:t xml:space="preserve">-w</w:t>
-      </w:r>
-      <w:r>
-        <w:rPr>
-          <w:rStyle w:val="NormalTok"/>
-        </w:rPr>
-        <w:t xml:space="preserve"> fields </w:t>
-      </w:r>
-      <w:r>
-        <w:rPr>
-          <w:rStyle w:val="KeywordTok"/>
-        </w:rPr>
-        <w:t xml:space="preserve">|</w:t>
-      </w:r>
-      <w:r>
-        <w:rPr>
-          <w:rStyle w:val="NormalTok"/>
-        </w:rPr>
-        <w:t xml:space="preserve"> </w:t>
-      </w:r>
-      <w:r>
-        <w:rPr>
-          <w:rStyle w:val="FunctionTok"/>
-        </w:rPr>
-        <w:t xml:space="preserve">grep</w:t>
-      </w:r>
-      <w:r>
-        <w:rPr>
-          <w:rStyle w:val="NormalTok"/>
-        </w:rPr>
-        <w:t xml:space="preserve"> </w:t>
-      </w:r>
-      <w:r>
-        <w:rPr>
-          <w:rStyle w:val="AttributeTok"/>
-        </w:rPr>
-        <w:t xml:space="preserve">-E</w:t>
-      </w:r>
-      <w:r>
-        <w:rPr>
-          <w:rStyle w:val="NormalTok"/>
-        </w:rPr>
-        <w:t xml:space="preserve"> </w:t>
-      </w:r>
-      <w:r>
-        <w:rPr>
-          <w:rStyle w:val="StringTok"/>
-        </w:rPr>
-        <w:t xml:space="preserve">'"DBSize"|"DBSizeInUse"|"DBSizeQuota"'</w:t>
-      </w:r>
-    </w:p>
-    <w:p>
-      <w:pPr>
-        <w:pStyle w:val="FirstParagraph"/>
-      </w:pPr>
-      <w:r>
-        <w:rPr>
-          <w:i/>
-          <w:iCs/>
-        </w:rPr>
-        <w:t xml:space="preserve">(We grep the</w:t>
-      </w:r>
-      <w:r>
-        <w:rPr>
-          <w:i/>
-          <w:iCs/>
-        </w:rPr>
-        <w:t xml:space="preserve"> </w:t>
-      </w:r>
-      <w:r>
-        <w:rPr>
-          <w:rStyle w:val="VerbatimChar"/>
-          <w:i/>
-          <w:iCs/>
-        </w:rPr>
-        <w:t xml:space="preserve">-w fields</w:t>
-      </w:r>
-      <w:r>
-        <w:rPr>
-          <w:i/>
-          <w:iCs/>
-        </w:rPr>
-        <w:t xml:space="preserve"> </w:t>
-      </w:r>
-      <w:r>
-        <w:rPr>
-          <w:i/>
-          <w:iCs/>
-        </w:rPr>
-        <w:t xml:space="preserve">output because the full</w:t>
-      </w:r>
-      <w:r>
-        <w:rPr>
-          <w:i/>
-          <w:iCs/>
-        </w:rPr>
-        <w:t xml:space="preserve"> </w:t>
-      </w:r>
-      <w:r>
-        <w:rPr>
-          <w:rStyle w:val="VerbatimChar"/>
-          <w:i/>
-          <w:iCs/>
-        </w:rPr>
-        <w:t xml:space="preserve">-w table</w:t>
-      </w:r>
-      <w:r>
-        <w:rPr>
-          <w:i/>
-          <w:iCs/>
-        </w:rPr>
-        <w:t xml:space="preserve"> </w:t>
-      </w:r>
-      <w:r>
-        <w:rPr>
-          <w:i/>
-          <w:iCs/>
-        </w:rPr>
-        <w:t xml:space="preserve">is 17 columns wide and unreadable.)</w:t>
-      </w:r>
-    </w:p>
-    <w:p>
-      <w:pPr>
-        <w:pStyle w:val="BodyText"/>
-      </w:pPr>
-      <w:r>
-        <w:rPr>
-          <w:b/>
-          <w:bCs/>
-        </w:rPr>
-        <w:t xml:space="preserve">What you should see:</w:t>
-      </w:r>
-      <w:r>
-        <w:t xml:space="preserve"> </w:t>
-      </w:r>
-      <w:r>
-        <w:rPr>
-          <w:rStyle w:val="VerbatimChar"/>
-        </w:rPr>
-        <w:t xml:space="preserve">DBSizeQuota</w:t>
-      </w:r>
-      <w:r>
-        <w:t xml:space="preserve"> </w:t>
-      </w:r>
-      <w:r>
-        <w:t xml:space="preserve">now reads</w:t>
-      </w:r>
-      <w:r>
-        <w:t xml:space="preserve"> </w:t>
-      </w:r>
-      <w:r>
-        <w:rPr>
-          <w:b/>
-          <w:bCs/>
-        </w:rPr>
-        <w:t xml:space="preserve">16777216</w:t>
-      </w:r>
-      <w:r>
-        <w:t xml:space="preserve"> </w:t>
-      </w:r>
-      <w:r>
-        <w:t xml:space="preserve">(16 MiB), with</w:t>
-      </w:r>
-      <w:r>
-        <w:t xml:space="preserve"> </w:t>
-      </w:r>
-      <w:r>
-        <w:rPr>
-          <w:rStyle w:val="VerbatimChar"/>
-        </w:rPr>
-        <w:t xml:space="preserve">DBSize</w:t>
-      </w:r>
-      <w:r>
-        <w:t xml:space="preserve"> </w:t>
-      </w:r>
-      <w:r>
-        <w:t xml:space="preserve">only ~0.5–2 MB — so there's ~15 MB of headroom to fill.</w:t>
-      </w:r>
-    </w:p>
-    <w:p>
-      <w:pPr>
-        <w:pStyle w:val="BodyText"/>
-      </w:pPr>
-      <w:r>
-        <w:drawing>
-          <wp:inline>
-            <wp:extent cx="5943600" cy="3736158"/>
-            <wp:effectExtent b="0" l="0" r="0" t="0"/>
-            <wp:docPr descr="etcd restarted with a 16 MiB quota" title="" id="18" name="Picture"/>
-            <a:graphic>
-              <a:graphicData uri="http://schemas.openxmlformats.org/drawingml/2006/picture">
-                <pic:pic>
-                  <pic:nvPicPr>
-                    <pic:cNvPr descr="artifacts/lab-03/screenshots/01-quota-lowered.png" id="19" name="Picture"/>
-                    <pic:cNvPicPr>
-                      <a:picLocks noChangeArrowheads="1" noChangeAspect="1"/>
-                    </pic:cNvPicPr>
-                  </pic:nvPicPr>
-                  <pic:blipFill>
-                    <a:blip r:embed="rId17"/>
+                    <a:blip r:embed="rId14"/>
                     <a:stretch>
                       <a:fillRect/>
                     </a:stretch>
@@ -1621,8 +1640,8 @@
         </w:pict>
       </w:r>
     </w:p>
-    <w:bookmarkEnd w:id="20"/>
-    <w:bookmarkStart w:id="24" w:name="X001d652a1b9a82f1b50ac780d3d9ca27053aeac"/>
+    <w:bookmarkEnd w:id="17"/>
+    <w:bookmarkStart w:id="21" w:name="X001d652a1b9a82f1b50ac780d3d9ca27053aeac"/>
     <w:p>
       <w:pPr>
         <w:pStyle w:val="Heading2"/>
@@ -2197,18 +2216,18 @@
           <wp:inline>
             <wp:extent cx="5943600" cy="3736158"/>
             <wp:effectExtent b="0" l="0" r="0" t="0"/>
-            <wp:docPr descr="The fill loop fails when the quota is crossed" title="" id="22" name="Picture"/>
+            <wp:docPr descr="The fill loop fails when the quota is crossed" title="" id="19" name="Picture"/>
             <a:graphic>
               <a:graphicData uri="http://schemas.openxmlformats.org/drawingml/2006/picture">
                 <pic:pic>
                   <pic:nvPicPr>
-                    <pic:cNvPr descr="artifacts/lab-03/screenshots/02-nospace-triggered.png" id="23" name="Picture"/>
+                    <pic:cNvPr descr="../../artifacts/lab-03/screenshots/02-nospace-triggered.png" id="20" name="Picture"/>
                     <pic:cNvPicPr>
                       <a:picLocks noChangeArrowheads="1" noChangeAspect="1"/>
                     </pic:cNvPicPr>
                   </pic:nvPicPr>
                   <pic:blipFill>
-                    <a:blip r:embed="rId21"/>
+                    <a:blip r:embed="rId18"/>
                     <a:stretch>
                       <a:fillRect/>
                     </a:stretch>
@@ -2260,8 +2279,8 @@
         </w:pict>
       </w:r>
     </w:p>
-    <w:bookmarkEnd w:id="24"/>
-    <w:bookmarkStart w:id="28" w:name="X17b40331cf47cf6fc5288105b949681953aed98"/>
+    <w:bookmarkEnd w:id="21"/>
+    <w:bookmarkStart w:id="25" w:name="X17b40331cf47cf6fc5288105b949681953aed98"/>
     <w:p>
       <w:pPr>
         <w:pStyle w:val="Heading2"/>
@@ -2612,18 +2631,18 @@
           <wp:inline>
             <wp:extent cx="5943600" cy="3736158"/>
             <wp:effectExtent b="0" l="0" r="0" t="0"/>
-            <wp:docPr descr="NOSPACE alarm, writes blocked, reads fine" title="" id="26" name="Picture"/>
+            <wp:docPr descr="NOSPACE alarm, writes blocked, reads fine" title="" id="23" name="Picture"/>
             <a:graphic>
               <a:graphicData uri="http://schemas.openxmlformats.org/drawingml/2006/picture">
                 <pic:pic>
                   <pic:nvPicPr>
-                    <pic:cNvPr descr="artifacts/lab-03/screenshots/03-cluster-read-only.png" id="27" name="Picture"/>
+                    <pic:cNvPr descr="../../artifacts/lab-03/screenshots/03-cluster-read-only.png" id="24" name="Picture"/>
                     <pic:cNvPicPr>
                       <a:picLocks noChangeArrowheads="1" noChangeAspect="1"/>
                     </pic:cNvPicPr>
                   </pic:nvPicPr>
                   <pic:blipFill>
-                    <a:blip r:embed="rId25"/>
+                    <a:blip r:embed="rId22"/>
                     <a:stretch>
                       <a:fillRect/>
                     </a:stretch>
@@ -2776,8 +2795,8 @@
         </w:pict>
       </w:r>
     </w:p>
-    <w:bookmarkEnd w:id="28"/>
-    <w:bookmarkStart w:id="32" w:name="step-4--recover-compact--defrag--disarm"/>
+    <w:bookmarkEnd w:id="25"/>
+    <w:bookmarkStart w:id="29" w:name="step-4--recover-compact--defrag--disarm"/>
     <w:p>
       <w:pPr>
         <w:pStyle w:val="Heading2"/>
@@ -3282,18 +3301,18 @@
           <wp:inline>
             <wp:extent cx="5943600" cy="3736158"/>
             <wp:effectExtent b="0" l="0" r="0" t="0"/>
-            <wp:docPr descr="Compact, defrag, disarm — writes accepted again" title="" id="30" name="Picture"/>
+            <wp:docPr descr="Compact, defrag, disarm — writes accepted again" title="" id="27" name="Picture"/>
             <a:graphic>
               <a:graphicData uri="http://schemas.openxmlformats.org/drawingml/2006/picture">
                 <pic:pic>
                   <pic:nvPicPr>
-                    <pic:cNvPr descr="artifacts/lab-03/screenshots/04-recovery.png" id="31" name="Picture"/>
+                    <pic:cNvPr descr="../../artifacts/lab-03/screenshots/04-recovery.png" id="28" name="Picture"/>
                     <pic:cNvPicPr>
                       <a:picLocks noChangeArrowheads="1" noChangeAspect="1"/>
                     </pic:cNvPicPr>
                   </pic:nvPicPr>
                   <pic:blipFill>
-                    <a:blip r:embed="rId29"/>
+                    <a:blip r:embed="rId26"/>
                     <a:stretch>
                       <a:fillRect/>
                     </a:stretch>
@@ -3443,8 +3462,8 @@
         </w:pict>
       </w:r>
     </w:p>
-    <w:bookmarkEnd w:id="32"/>
-    <w:bookmarkStart w:id="36" w:name="Xa70ed9778096c241daa4c54c78eaa0f5da01380"/>
+    <w:bookmarkEnd w:id="29"/>
+    <w:bookmarkStart w:id="33" w:name="Xa70ed9778096c241daa4c54c78eaa0f5da01380"/>
     <w:p>
       <w:pPr>
         <w:pStyle w:val="Heading2"/>
@@ -3867,18 +3886,18 @@
           <wp:inline>
             <wp:extent cx="5943600" cy="3736158"/>
             <wp:effectExtent b="0" l="0" r="0" t="0"/>
-            <wp:docPr descr="Deleting the junk and reclaiming space returns the DB to baseline" title="" id="34" name="Picture"/>
+            <wp:docPr descr="Deleting the junk and reclaiming space returns the DB to baseline" title="" id="31" name="Picture"/>
             <a:graphic>
               <a:graphicData uri="http://schemas.openxmlformats.org/drawingml/2006/picture">
                 <pic:pic>
                   <pic:nvPicPr>
-                    <pic:cNvPr descr="artifacts/lab-03/screenshots/05-reclaim-and-cleanup.png" id="35" name="Picture"/>
+                    <pic:cNvPr descr="../../artifacts/lab-03/screenshots/05-reclaim-and-cleanup.png" id="32" name="Picture"/>
                     <pic:cNvPicPr>
                       <a:picLocks noChangeArrowheads="1" noChangeAspect="1"/>
                     </pic:cNvPicPr>
                   </pic:nvPicPr>
                   <pic:blipFill>
-                    <a:blip r:embed="rId33"/>
+                    <a:blip r:embed="rId30"/>
                     <a:stretch>
                       <a:fillRect/>
                     </a:stretch>
@@ -3946,8 +3965,8 @@
         </w:pict>
       </w:r>
     </w:p>
-    <w:bookmarkEnd w:id="36"/>
-    <w:bookmarkStart w:id="37" w:name="step-6--clean-up"/>
+    <w:bookmarkEnd w:id="33"/>
+    <w:bookmarkStart w:id="34" w:name="step-6--clean-up"/>
     <w:p>
       <w:pPr>
         <w:pStyle w:val="Heading2"/>
@@ -4041,8 +4060,8 @@
         </w:pict>
       </w:r>
     </w:p>
-    <w:bookmarkEnd w:id="37"/>
-    <w:bookmarkStart w:id="38" w:name="what-you-learned"/>
+    <w:bookmarkEnd w:id="34"/>
+    <w:bookmarkStart w:id="35" w:name="what-you-learned"/>
     <w:p>
       <w:pPr>
         <w:pStyle w:val="Heading2"/>
@@ -4389,8 +4408,8 @@
         </w:tc>
       </w:tr>
     </w:tbl>
-    <w:bookmarkEnd w:id="38"/>
-    <w:bookmarkStart w:id="42" w:name="evidence"/>
+    <w:bookmarkEnd w:id="35"/>
+    <w:bookmarkStart w:id="39" w:name="evidence"/>
     <w:p>
       <w:pPr>
         <w:pStyle w:val="Heading2"/>
@@ -4409,7 +4428,7 @@
       <w:r>
         <w:t xml:space="preserve"> </w:t>
       </w:r>
-      <w:hyperlink r:id="rId39">
+      <w:hyperlink r:id="rId36">
         <w:r>
           <w:rPr>
             <w:rStyle w:val="VerbatimChar"/>
@@ -4426,7 +4445,7 @@
       <w:r>
         <w:t xml:space="preserve"> </w:t>
       </w:r>
-      <w:hyperlink r:id="rId40">
+      <w:hyperlink r:id="rId37">
         <w:r>
           <w:rPr>
             <w:rStyle w:val="VerbatimChar"/>
@@ -4466,7 +4485,7 @@
       <w:r>
         <w:t xml:space="preserve"> </w:t>
       </w:r>
-      <w:hyperlink r:id="rId41">
+      <w:hyperlink r:id="rId38">
         <w:r>
           <w:rPr>
             <w:rStyle w:val="Hyperlink"/>
@@ -4475,7 +4494,7 @@
         </w:r>
       </w:hyperlink>
     </w:p>
-    <w:bookmarkEnd w:id="42"/>
+    <w:bookmarkEnd w:id="39"/>
     <w:sectPr>
       <w:pgSz w:h="15840" w:w="12240"/>
       <w:pgMar w:bottom="1440" w:footer="720" w:gutter="0" w:header="720" w:left="1440" w:right="1440" w:top="1440"/>

</xml_diff>